<commit_message>
upload week 6 and clean old directories
</commit_message>
<xml_diff>
--- a/week 1/Letter.docx
+++ b/week 1/Letter.docx
@@ -1,6 +1,6 @@
 
 <file path=word/document.xml><?xml version="1.0" encoding="utf-8"?>
-<w:document xmlns:wpc="http://schemas.microsoft.com/office/word/2010/wordprocessingCanvas" xmlns:cx="http://schemas.microsoft.com/office/drawing/2014/chartex" xmlns:cx1="http://schemas.microsoft.com/office/drawing/2015/9/8/chartex" xmlns:cx2="http://schemas.microsoft.com/office/drawing/2015/10/21/chartex" xmlns:cx3="http://schemas.microsoft.com/office/drawing/2016/5/9/chartex" xmlns:cx4="http://schemas.microsoft.com/office/drawing/2016/5/10/chartex" xmlns:cx5="http://schemas.microsoft.com/office/drawing/2016/5/11/chartex" xmlns:cx6="http://schemas.microsoft.com/office/drawing/2016/5/12/chartex" xmlns:cx7="http://schemas.microsoft.com/office/drawing/2016/5/13/chartex" xmlns:cx8="http://schemas.microsoft.com/office/drawing/2016/5/14/chartex" xmlns:mc="http://schemas.openxmlformats.org/markup-compatibility/2006" xmlns:aink="http://schemas.microsoft.com/office/drawing/2016/ink" xmlns:am3d="http://schemas.microsoft.com/office/drawing/2017/model3d" xmlns:o="urn:schemas-microsoft-com:office:office" xmlns:oel="http://schemas.microsoft.com/office/2019/extlst" xmlns:r="http://schemas.openxmlformats.org/officeDocument/2006/relationships" xmlns:m="http://schemas.openxmlformats.org/officeDocument/2006/math" xmlns:v="urn:schemas-microsoft-com:vml" xmlns:wp14="http://schemas.microsoft.com/office/word/2010/wordprocessingDrawing" xmlns:wp="http://schemas.openxmlformats.org/drawingml/2006/wordprocessingDrawing" xmlns:w10="urn:schemas-microsoft-com:office:word" xmlns:w="http://schemas.openxmlformats.org/wordprocessingml/2006/main" xmlns:w14="http://schemas.microsoft.com/office/word/2010/wordml" xmlns:w15="http://schemas.microsoft.com/office/word/2012/wordml" xmlns:w16cex="http://schemas.microsoft.com/office/word/2018/wordml/cex" xmlns:w16cid="http://schemas.microsoft.com/office/word/2016/wordml/cid" xmlns:w16="http://schemas.microsoft.com/office/word/2018/wordml" xmlns:w16sdtdh="http://schemas.microsoft.com/office/word/2020/wordml/sdtdatahash" xmlns:w16se="http://schemas.microsoft.com/office/word/2015/wordml/symex" xmlns:wpg="http://schemas.microsoft.com/office/word/2010/wordprocessingGroup" xmlns:wpi="http://schemas.microsoft.com/office/word/2010/wordprocessingInk" xmlns:wne="http://schemas.microsoft.com/office/word/2006/wordml" xmlns:wps="http://schemas.microsoft.com/office/word/2010/wordprocessingShape" mc:Ignorable="w14 w15 w16se w16cid w16 w16cex w16sdtdh wp14">
+<w:document xmlns:wpc="http://schemas.microsoft.com/office/word/2010/wordprocessingCanvas" xmlns:cx="http://schemas.microsoft.com/office/drawing/2014/chartex" xmlns:cx1="http://schemas.microsoft.com/office/drawing/2015/9/8/chartex" xmlns:cx2="http://schemas.microsoft.com/office/drawing/2015/10/21/chartex" xmlns:cx3="http://schemas.microsoft.com/office/drawing/2016/5/9/chartex" xmlns:cx4="http://schemas.microsoft.com/office/drawing/2016/5/10/chartex" xmlns:cx5="http://schemas.microsoft.com/office/drawing/2016/5/11/chartex" xmlns:cx6="http://schemas.microsoft.com/office/drawing/2016/5/12/chartex" xmlns:cx7="http://schemas.microsoft.com/office/drawing/2016/5/13/chartex" xmlns:cx8="http://schemas.microsoft.com/office/drawing/2016/5/14/chartex" xmlns:mc="http://schemas.openxmlformats.org/markup-compatibility/2006" xmlns:aink="http://schemas.microsoft.com/office/drawing/2016/ink" xmlns:am3d="http://schemas.microsoft.com/office/drawing/2017/model3d" xmlns:o="urn:schemas-microsoft-com:office:office" xmlns:oel="http://schemas.microsoft.com/office/2019/extlst" xmlns:r="http://schemas.openxmlformats.org/officeDocument/2006/relationships" xmlns:m="http://schemas.openxmlformats.org/officeDocument/2006/math" xmlns:v="urn:schemas-microsoft-com:vml" xmlns:wp14="http://schemas.microsoft.com/office/word/2010/wordprocessingDrawing" xmlns:wp="http://schemas.openxmlformats.org/drawingml/2006/wordprocessingDrawing" xmlns:w10="urn:schemas-microsoft-com:office:word" xmlns:w="http://schemas.openxmlformats.org/wordprocessingml/2006/main" xmlns:w14="http://schemas.microsoft.com/office/word/2010/wordml" xmlns:w15="http://schemas.microsoft.com/office/word/2012/wordml" xmlns:w16cex="http://schemas.microsoft.com/office/word/2018/wordml/cex" xmlns:w16cid="http://schemas.microsoft.com/office/word/2016/wordml/cid" xmlns:w16="http://schemas.microsoft.com/office/word/2018/wordml" xmlns:w16du="http://schemas.microsoft.com/office/word/2023/wordml/word16du" xmlns:w16sdtdh="http://schemas.microsoft.com/office/word/2020/wordml/sdtdatahash" xmlns:w16sdtfl="http://schemas.microsoft.com/office/word/2024/wordml/sdtformatlock" xmlns:w16se="http://schemas.microsoft.com/office/word/2015/wordml/symex" xmlns:wpg="http://schemas.microsoft.com/office/word/2010/wordprocessingGroup" xmlns:wpi="http://schemas.microsoft.com/office/word/2010/wordprocessingInk" xmlns:wne="http://schemas.microsoft.com/office/word/2006/wordml" xmlns:wps="http://schemas.microsoft.com/office/word/2010/wordprocessingShape" mc:Ignorable="w14 w15 w16se w16cid w16 w16cex w16sdtdh w16sdtfl w16du wp14">
   <w:body>
     <w:p>
       <w:pPr>
@@ -14,7 +14,7 @@
         <w:rPr>
           <w:rFonts w:ascii="Times New Roman" w:hAnsi="Times New Roman" w:cs="Times New Roman"/>
         </w:rPr>
-        <w:t>July 15, 2020,</w:t>
+        <w:t>July 15, 2020</w:t>
       </w:r>
     </w:p>
     <w:p>
@@ -519,19 +519,11 @@
                               </w:rPr>
                               <w:tab/>
                             </w:r>
-                            <w:proofErr w:type="spellStart"/>
-                            <w:r>
-                              <w:rPr>
-                                <w:rFonts w:ascii="Times New Roman" w:hAnsi="Times New Roman" w:cs="Times New Roman"/>
-                              </w:rPr>
-                              <w:t>Pankan</w:t>
-                            </w:r>
-                            <w:proofErr w:type="spellEnd"/>
-                            <w:r>
-                              <w:rPr>
-                                <w:rFonts w:ascii="Times New Roman" w:hAnsi="Times New Roman" w:cs="Times New Roman"/>
-                              </w:rPr>
-                              <w:t xml:space="preserve"> Krishnan</w:t>
+                            <w:r>
+                              <w:rPr>
+                                <w:rFonts w:ascii="Times New Roman" w:hAnsi="Times New Roman" w:cs="Times New Roman"/>
+                              </w:rPr>
+                              <w:t>Pankan Krishnan</w:t>
                             </w:r>
                           </w:p>
                           <w:p>
@@ -618,21 +610,7 @@
                                 <w:rFonts w:ascii="Times New Roman" w:hAnsi="Times New Roman" w:cs="Times New Roman"/>
                               </w:rPr>
                               <w:tab/>
-                              <w:t xml:space="preserve">Sri Ranga Apartments, </w:t>
-                            </w:r>
-                            <w:proofErr w:type="gramStart"/>
-                            <w:r>
-                              <w:rPr>
-                                <w:rFonts w:ascii="Times New Roman" w:hAnsi="Times New Roman" w:cs="Times New Roman"/>
-                              </w:rPr>
-                              <w:t>No</w:t>
-                            </w:r>
-                            <w:proofErr w:type="gramEnd"/>
-                            <w:r>
-                              <w:rPr>
-                                <w:rFonts w:ascii="Times New Roman" w:hAnsi="Times New Roman" w:cs="Times New Roman"/>
-                              </w:rPr>
-                              <w:t>: 120, II Avenue, T. Nagar. Chennai-17</w:t>
+                              <w:t>Sri Ranga Apartments, No: 120, II Avenue, T. Nagar. Chennai-17</w:t>
                             </w:r>
                           </w:p>
                           <w:p>
@@ -1201,19 +1179,11 @@
                         </w:rPr>
                         <w:tab/>
                       </w:r>
-                      <w:proofErr w:type="spellStart"/>
                       <w:r>
                         <w:rPr>
                           <w:rFonts w:ascii="Times New Roman" w:hAnsi="Times New Roman" w:cs="Times New Roman"/>
                         </w:rPr>
-                        <w:t>Pankan</w:t>
-                      </w:r>
-                      <w:proofErr w:type="spellEnd"/>
-                      <w:r>
-                        <w:rPr>
-                          <w:rFonts w:ascii="Times New Roman" w:hAnsi="Times New Roman" w:cs="Times New Roman"/>
-                        </w:rPr>
-                        <w:t xml:space="preserve"> Krishnan</w:t>
+                        <w:t>Pankan Krishnan</w:t>
                       </w:r>
                     </w:p>
                     <w:p>
@@ -1300,21 +1270,7 @@
                           <w:rFonts w:ascii="Times New Roman" w:hAnsi="Times New Roman" w:cs="Times New Roman"/>
                         </w:rPr>
                         <w:tab/>
-                        <w:t xml:space="preserve">Sri Ranga Apartments, </w:t>
-                      </w:r>
-                      <w:proofErr w:type="gramStart"/>
-                      <w:r>
-                        <w:rPr>
-                          <w:rFonts w:ascii="Times New Roman" w:hAnsi="Times New Roman" w:cs="Times New Roman"/>
-                        </w:rPr>
-                        <w:t>No</w:t>
-                      </w:r>
-                      <w:proofErr w:type="gramEnd"/>
-                      <w:r>
-                        <w:rPr>
-                          <w:rFonts w:ascii="Times New Roman" w:hAnsi="Times New Roman" w:cs="Times New Roman"/>
-                        </w:rPr>
-                        <w:t>: 120, II Avenue, T. Nagar. Chennai-17</w:t>
+                        <w:t>Sri Ranga Apartments, No: 120, II Avenue, T. Nagar. Chennai-17</w:t>
                       </w:r>
                     </w:p>
                     <w:p>
@@ -1823,7 +1779,7 @@
 </file>
 
 <file path=word/recipientData.xml><?xml version="1.0" encoding="utf-8"?>
-<wne:recipients xmlns:wpc="http://schemas.microsoft.com/office/word/2010/wordprocessingCanvas" xmlns:cx="http://schemas.microsoft.com/office/drawing/2014/chartex" xmlns:cx1="http://schemas.microsoft.com/office/drawing/2015/9/8/chartex" xmlns:cx2="http://schemas.microsoft.com/office/drawing/2015/10/21/chartex" xmlns:cx3="http://schemas.microsoft.com/office/drawing/2016/5/9/chartex" xmlns:cx4="http://schemas.microsoft.com/office/drawing/2016/5/10/chartex" xmlns:cx5="http://schemas.microsoft.com/office/drawing/2016/5/11/chartex" xmlns:cx6="http://schemas.microsoft.com/office/drawing/2016/5/12/chartex" xmlns:cx7="http://schemas.microsoft.com/office/drawing/2016/5/13/chartex" xmlns:cx8="http://schemas.microsoft.com/office/drawing/2016/5/14/chartex" xmlns:mc="http://schemas.openxmlformats.org/markup-compatibility/2006" xmlns:aink="http://schemas.microsoft.com/office/drawing/2016/ink" xmlns:am3d="http://schemas.microsoft.com/office/drawing/2017/model3d" xmlns:o="urn:schemas-microsoft-com:office:office" xmlns:oel="http://schemas.microsoft.com/office/2019/extlst" xmlns:r="http://schemas.openxmlformats.org/officeDocument/2006/relationships" xmlns:m="http://schemas.openxmlformats.org/officeDocument/2006/math" xmlns:v="urn:schemas-microsoft-com:vml" xmlns:wp14="http://schemas.microsoft.com/office/word/2010/wordprocessingDrawing" xmlns:wp="http://schemas.openxmlformats.org/drawingml/2006/wordprocessingDrawing" xmlns:w10="urn:schemas-microsoft-com:office:word" xmlns:w="http://schemas.openxmlformats.org/wordprocessingml/2006/main" xmlns:w14="http://schemas.microsoft.com/office/word/2010/wordml" xmlns:w15="http://schemas.microsoft.com/office/word/2012/wordml" xmlns:w16cex="http://schemas.microsoft.com/office/word/2018/wordml/cex" xmlns:w16cid="http://schemas.microsoft.com/office/word/2016/wordml/cid" xmlns:w16="http://schemas.microsoft.com/office/word/2018/wordml" xmlns:w16sdtdh="http://schemas.microsoft.com/office/word/2020/wordml/sdtdatahash" xmlns:w16se="http://schemas.microsoft.com/office/word/2015/wordml/symex" xmlns:wpg="http://schemas.microsoft.com/office/word/2010/wordprocessingGroup" xmlns:wpi="http://schemas.microsoft.com/office/word/2010/wordprocessingInk" xmlns:wne="http://schemas.microsoft.com/office/word/2006/wordml" xmlns:wps="http://schemas.microsoft.com/office/word/2010/wordprocessingShape" mc:Ignorable="w14 w15 w16se w16cid w16 w16cex w16sdtdh wp14">
+<wne:recipients xmlns:wpc="http://schemas.microsoft.com/office/word/2010/wordprocessingCanvas" xmlns:cx="http://schemas.microsoft.com/office/drawing/2014/chartex" xmlns:cx1="http://schemas.microsoft.com/office/drawing/2015/9/8/chartex" xmlns:cx2="http://schemas.microsoft.com/office/drawing/2015/10/21/chartex" xmlns:cx3="http://schemas.microsoft.com/office/drawing/2016/5/9/chartex" xmlns:cx4="http://schemas.microsoft.com/office/drawing/2016/5/10/chartex" xmlns:cx5="http://schemas.microsoft.com/office/drawing/2016/5/11/chartex" xmlns:cx6="http://schemas.microsoft.com/office/drawing/2016/5/12/chartex" xmlns:cx7="http://schemas.microsoft.com/office/drawing/2016/5/13/chartex" xmlns:cx8="http://schemas.microsoft.com/office/drawing/2016/5/14/chartex" xmlns:mc="http://schemas.openxmlformats.org/markup-compatibility/2006" xmlns:aink="http://schemas.microsoft.com/office/drawing/2016/ink" xmlns:am3d="http://schemas.microsoft.com/office/drawing/2017/model3d" xmlns:o="urn:schemas-microsoft-com:office:office" xmlns:oel="http://schemas.microsoft.com/office/2019/extlst" xmlns:r="http://schemas.openxmlformats.org/officeDocument/2006/relationships" xmlns:m="http://schemas.openxmlformats.org/officeDocument/2006/math" xmlns:v="urn:schemas-microsoft-com:vml" xmlns:wp14="http://schemas.microsoft.com/office/word/2010/wordprocessingDrawing" xmlns:wp="http://schemas.openxmlformats.org/drawingml/2006/wordprocessingDrawing" xmlns:w10="urn:schemas-microsoft-com:office:word" xmlns:w="http://schemas.openxmlformats.org/wordprocessingml/2006/main" xmlns:w14="http://schemas.microsoft.com/office/word/2010/wordml" xmlns:w15="http://schemas.microsoft.com/office/word/2012/wordml" xmlns:w16cex="http://schemas.microsoft.com/office/word/2018/wordml/cex" xmlns:w16cid="http://schemas.microsoft.com/office/word/2016/wordml/cid" xmlns:w16="http://schemas.microsoft.com/office/word/2018/wordml" xmlns:w16du="http://schemas.microsoft.com/office/word/2023/wordml/word16du" xmlns:w16sdtdh="http://schemas.microsoft.com/office/word/2020/wordml/sdtdatahash" xmlns:w16sdtfl="http://schemas.microsoft.com/office/word/2024/wordml/sdtformatlock" xmlns:w16se="http://schemas.microsoft.com/office/word/2015/wordml/symex" xmlns:wpg="http://schemas.microsoft.com/office/word/2010/wordprocessingGroup" xmlns:wpi="http://schemas.microsoft.com/office/word/2010/wordprocessingInk" xmlns:wne="http://schemas.microsoft.com/office/word/2006/wordml" xmlns:wps="http://schemas.microsoft.com/office/word/2010/wordprocessingShape" mc:Ignorable="w14 w15 w16se w16cid w16 w16cex w16sdtdh w16sdtfl w16du wp14">
   <wne:recipientData>
     <wne:active wne:val="1"/>
     <wne:hash wne:val="659756533"/>
@@ -1836,17 +1792,11 @@
     <wne:active wne:val="1"/>
     <wne:hash wne:val="1700908231"/>
   </wne:recipientData>
-  <wne:recipientData>
-    <wne:active wne:val="1"/>
-  </wne:recipientData>
-  <wne:recipientData>
-    <wne:active wne:val="1"/>
-  </wne:recipientData>
 </wne:recipients>
 </file>
 
 <file path=word/styles.xml><?xml version="1.0" encoding="utf-8"?>
-<w:styles xmlns:mc="http://schemas.openxmlformats.org/markup-compatibility/2006" xmlns:r="http://schemas.openxmlformats.org/officeDocument/2006/relationships" xmlns:w="http://schemas.openxmlformats.org/wordprocessingml/2006/main" xmlns:w14="http://schemas.microsoft.com/office/word/2010/wordml" xmlns:w15="http://schemas.microsoft.com/office/word/2012/wordml" xmlns:w16cex="http://schemas.microsoft.com/office/word/2018/wordml/cex" xmlns:w16cid="http://schemas.microsoft.com/office/word/2016/wordml/cid" xmlns:w16="http://schemas.microsoft.com/office/word/2018/wordml" xmlns:w16sdtdh="http://schemas.microsoft.com/office/word/2020/wordml/sdtdatahash" xmlns:w16se="http://schemas.microsoft.com/office/word/2015/wordml/symex" mc:Ignorable="w14 w15 w16se w16cid w16 w16cex w16sdtdh">
+<w:styles xmlns:mc="http://schemas.openxmlformats.org/markup-compatibility/2006" xmlns:r="http://schemas.openxmlformats.org/officeDocument/2006/relationships" xmlns:w="http://schemas.openxmlformats.org/wordprocessingml/2006/main" xmlns:w14="http://schemas.microsoft.com/office/word/2010/wordml" xmlns:w15="http://schemas.microsoft.com/office/word/2012/wordml" xmlns:w16cex="http://schemas.microsoft.com/office/word/2018/wordml/cex" xmlns:w16cid="http://schemas.microsoft.com/office/word/2016/wordml/cid" xmlns:w16="http://schemas.microsoft.com/office/word/2018/wordml" xmlns:w16du="http://schemas.microsoft.com/office/word/2023/wordml/word16du" xmlns:w16sdtdh="http://schemas.microsoft.com/office/word/2020/wordml/sdtdatahash" xmlns:w16sdtfl="http://schemas.microsoft.com/office/word/2024/wordml/sdtformatlock" xmlns:w16se="http://schemas.microsoft.com/office/word/2015/wordml/symex" mc:Ignorable="w14 w15 w16se w16cid w16 w16cex w16sdtdh w16sdtfl w16du">
   <w:docDefaults>
     <w:rPrDefault>
       <w:rPr>

</xml_diff>